<commit_message>
uncommented sample 1 code to get start and end time
</commit_message>
<xml_diff>
--- a/07 - Spike - Performance Measurement/Task 07 - Lab Spike Report.docx
+++ b/07 - Spike - Performance Measurement/Task 07 - Lab Spike Report.docx
@@ -123,12 +123,26 @@
           <w:rStyle w:val="SubtleReference"/>
         </w:rPr>
       </w:pPr>
-      <w:r>
-        <w:rPr>
-          <w:rStyle w:val="SubtleReference"/>
-        </w:rPr>
-        <w:t>Summarise from the spike plan goal</w:t>
-      </w:r>
+    </w:p>
+    <w:p>
+      <w:pPr>
+        <w:rPr>
+          <w:rStyle w:val="SubtleReference"/>
+        </w:rPr>
+      </w:pPr>
+      <w:r>
+        <w:rPr>
+          <w:rStyle w:val="SubtleReference"/>
+        </w:rPr>
+        <w:t>The goal of this spike task is to demonstrate my ability to collect and analyse software performance data while applying my knowledge in comparing and evaluating functions, IDE and complier settings.</w:t>
+      </w:r>
+    </w:p>
+    <w:p>
+      <w:pPr>
+        <w:rPr>
+          <w:rStyle w:val="SubtleReference"/>
+        </w:rPr>
+      </w:pPr>
     </w:p>
     <w:p>
       <w:pPr>
@@ -155,18 +169,6 @@
           <w:rStyle w:val="SubtleReference"/>
         </w:rPr>
       </w:pPr>
-      <w:r>
-        <w:rPr>
-          <w:rStyle w:val="SubtleReference"/>
-        </w:rPr>
-        <w:t>For example: UML diagram</w:t>
-      </w:r>
-      <w:r>
-        <w:rPr>
-          <w:rStyle w:val="SubtleReference"/>
-        </w:rPr>
-        <w:t>, code, reports</w:t>
-      </w:r>
     </w:p>
     <w:p>
       <w:pPr>
@@ -183,7 +185,48 @@
         <w:rPr>
           <w:rStyle w:val="SubtleReference"/>
         </w:rPr>
-        <w:t>Code see /spikes/spike04/</w:t>
+        <w:t xml:space="preserve">Code see </w:t>
+      </w:r>
+      <w:r>
+        <w:rPr>
+          <w:rStyle w:val="SubtleReference"/>
+        </w:rPr>
+        <w:t>\COS30031-2023-102608927\07 - Spike - Performance Measurement\Task7\Task7</w:t>
+      </w:r>
+    </w:p>
+    <w:p>
+      <w:pPr>
+        <w:rPr>
+          <w:rStyle w:val="SubtleReference"/>
+        </w:rPr>
+      </w:pPr>
+    </w:p>
+    <w:p>
+      <w:pPr>
+        <w:rPr>
+          <w:b/>
+          <w:sz w:val="24"/>
+        </w:rPr>
+      </w:pPr>
+      <w:r>
+        <w:rPr>
+          <w:b/>
+          <w:sz w:val="24"/>
+        </w:rPr>
+        <w:t>Technologies, Tools, and Resources used:</w:t>
+      </w:r>
+    </w:p>
+    <w:p>
+      <w:pPr>
+        <w:rPr>
+          <w:rStyle w:val="SubtleReference"/>
+        </w:rPr>
+      </w:pPr>
+      <w:r>
+        <w:rPr>
+          <w:rStyle w:val="SubtleReference"/>
+        </w:rPr>
+        <w:t>List of information needed by someone trying to reproduce this work</w:t>
       </w:r>
     </w:p>
     <w:p>
@@ -201,13 +244,13 @@
         <w:rPr>
           <w:rStyle w:val="SubtleReference"/>
         </w:rPr>
-        <w:t>Short report titled “ide compar</w:t>
-      </w:r>
-      <w:r>
-        <w:rPr>
-          <w:rStyle w:val="SubtleReference"/>
-        </w:rPr>
-        <w:t>ison”</w:t>
+        <w:t>V</w:t>
+      </w:r>
+      <w:r>
+        <w:rPr>
+          <w:rStyle w:val="SubtleReference"/>
+        </w:rPr>
+        <w:t>isual Studio 2022 Community Edition</w:t>
       </w:r>
     </w:p>
     <w:p>
@@ -225,42 +268,7 @@
         <w:rPr>
           <w:rStyle w:val="SubtleReference"/>
         </w:rPr>
-        <w:t>…</w:t>
-      </w:r>
-    </w:p>
-    <w:p>
-      <w:pPr>
-        <w:rPr>
-          <w:rStyle w:val="SubtleReference"/>
-        </w:rPr>
-      </w:pPr>
-    </w:p>
-    <w:p>
-      <w:pPr>
-        <w:rPr>
-          <w:b/>
-          <w:sz w:val="24"/>
-        </w:rPr>
-      </w:pPr>
-      <w:r>
-        <w:rPr>
-          <w:b/>
-          <w:sz w:val="24"/>
-        </w:rPr>
-        <w:t>Technologies, Tools, and Resources used:</w:t>
-      </w:r>
-    </w:p>
-    <w:p>
-      <w:pPr>
-        <w:rPr>
-          <w:rStyle w:val="SubtleReference"/>
-        </w:rPr>
-      </w:pPr>
-      <w:r>
-        <w:rPr>
-          <w:rStyle w:val="SubtleReference"/>
-        </w:rPr>
-        <w:t>List of information needed by someone trying to reproduce this work</w:t>
+        <w:t>GitHub</w:t>
       </w:r>
     </w:p>
     <w:p>
@@ -278,7 +286,30 @@
         <w:rPr>
           <w:rStyle w:val="SubtleReference"/>
         </w:rPr>
-        <w:t>Visual Studio 2010</w:t>
+        <w:t>Lecture 3.1 Code Performance Notes.</w:t>
+      </w:r>
+    </w:p>
+    <w:p>
+      <w:pPr>
+        <w:pStyle w:val="ColorfulList-Accent11"/>
+        <w:rPr>
+          <w:rStyle w:val="SubtleReference"/>
+        </w:rPr>
+      </w:pPr>
+    </w:p>
+    <w:p>
+      <w:pPr>
+        <w:rPr>
+          <w:b/>
+          <w:sz w:val="24"/>
+        </w:rPr>
+      </w:pPr>
+      <w:r>
+        <w:rPr>
+          <w:b/>
+          <w:sz w:val="24"/>
+        </w:rPr>
+        <w:t xml:space="preserve">Tasks undertaken: </w:t>
       </w:r>
     </w:p>
     <w:p>
@@ -296,7 +327,7 @@
         <w:rPr>
           <w:rStyle w:val="SubtleReference"/>
         </w:rPr>
-        <w:t>SDL version 1.2.3.4</w:t>
+        <w:t>Download and install Visual Studio</w:t>
       </w:r>
     </w:p>
     <w:p>
@@ -314,25 +345,13 @@
         <w:rPr>
           <w:rStyle w:val="SubtleReference"/>
         </w:rPr>
-        <w:t>Funky Monkey</w:t>
-      </w:r>
-      <w:r>
-        <w:rPr>
-          <w:rStyle w:val="SubtleReference"/>
-        </w:rPr>
-        <w:t xml:space="preserve"> tutorials</w:t>
-      </w:r>
-      <w:r>
-        <w:rPr>
-          <w:rStyle w:val="SubtleReference"/>
-        </w:rPr>
-        <w:t>:</w:t>
-      </w:r>
-      <w:r>
-        <w:rPr>
-          <w:rStyle w:val="SubtleReference"/>
-        </w:rPr>
-        <w:t xml:space="preserve"> http://www.blahdeblah.org</w:t>
+        <w:t xml:space="preserve">Download and install </w:t>
+      </w:r>
+      <w:r>
+        <w:rPr>
+          <w:rStyle w:val="SubtleReference"/>
+        </w:rPr>
+        <w:t xml:space="preserve">Visual Studio C++ Debugging Packages </w:t>
       </w:r>
     </w:p>
     <w:p>
@@ -350,74 +369,19 @@
         <w:rPr>
           <w:rStyle w:val="SubtleReference"/>
         </w:rPr>
-        <w:t>…</w:t>
-      </w:r>
-    </w:p>
-    <w:p>
-      <w:pPr>
-        <w:rPr>
-          <w:rStyle w:val="SubtleReference"/>
-        </w:rPr>
-      </w:pPr>
-    </w:p>
-    <w:p>
-      <w:pPr>
-        <w:rPr>
-          <w:b/>
-          <w:sz w:val="24"/>
-        </w:rPr>
-      </w:pPr>
-      <w:r>
-        <w:rPr>
-          <w:b/>
-          <w:sz w:val="24"/>
-        </w:rPr>
-        <w:t xml:space="preserve">Tasks undertaken: </w:t>
-      </w:r>
-    </w:p>
-    <w:p>
-      <w:pPr>
-        <w:pStyle w:val="ColorfulList-Accent11"/>
-        <w:ind w:left="0"/>
-        <w:rPr>
-          <w:rStyle w:val="SubtleReference"/>
-        </w:rPr>
-      </w:pPr>
-      <w:r>
-        <w:rPr>
-          <w:rStyle w:val="SubtleReference"/>
-        </w:rPr>
-        <w:t>List key tasks likely to help another developer</w:t>
-      </w:r>
-    </w:p>
-    <w:p>
-      <w:pPr>
-        <w:pStyle w:val="ColorfulList-Accent11"/>
-        <w:ind w:left="0"/>
-        <w:rPr>
-          <w:rStyle w:val="SubtleReference"/>
-        </w:rPr>
-      </w:pPr>
-      <w:r>
-        <w:rPr>
-          <w:rStyle w:val="SubtleReference"/>
-        </w:rPr>
-        <w:t>This section should resemble a tutorial – the goal is to allow another coder to reproduce your work following these steps.</w:t>
-      </w:r>
-    </w:p>
-    <w:p>
-      <w:pPr>
-        <w:pStyle w:val="ColorfulList-Accent11"/>
-        <w:ind w:left="0"/>
-        <w:rPr>
-          <w:rStyle w:val="SubtleReference"/>
-        </w:rPr>
-      </w:pPr>
-      <w:r>
-        <w:rPr>
-          <w:rStyle w:val="SubtleReference"/>
-        </w:rPr>
-        <w:t>Eg: (Good)</w:t>
+        <w:t xml:space="preserve">Create and </w:t>
+      </w:r>
+      <w:r>
+        <w:rPr>
+          <w:rStyle w:val="SubtleReference"/>
+        </w:rPr>
+        <w:t xml:space="preserve">Configure VS Project File </w:t>
+      </w:r>
+      <w:r>
+        <w:rPr>
+          <w:rStyle w:val="SubtleReference"/>
+        </w:rPr>
+        <w:t>with a .cpp file to build.</w:t>
       </w:r>
     </w:p>
     <w:p>
@@ -435,14 +399,14 @@
         <w:rPr>
           <w:rStyle w:val="SubtleReference"/>
         </w:rPr>
-        <w:t>Download and install Visual Studio</w:t>
+        <w:t xml:space="preserve">Debug Run Tests such as </w:t>
       </w:r>
     </w:p>
     <w:p>
       <w:pPr>
         <w:pStyle w:val="ColorfulList-Accent11"/>
         <w:numPr>
-          <w:ilvl w:val="0"/>
+          <w:ilvl w:val="1"/>
           <w:numId w:val="1"/>
         </w:numPr>
         <w:rPr>
@@ -453,14 +417,14 @@
         <w:rPr>
           <w:rStyle w:val="SubtleReference"/>
         </w:rPr>
-        <w:t>Download and install DirectX</w:t>
+        <w:t>Single Tests</w:t>
       </w:r>
     </w:p>
     <w:p>
       <w:pPr>
         <w:pStyle w:val="ColorfulList-Accent11"/>
         <w:numPr>
-          <w:ilvl w:val="0"/>
+          <w:ilvl w:val="1"/>
           <w:numId w:val="1"/>
         </w:numPr>
         <w:rPr>
@@ -471,14 +435,14 @@
         <w:rPr>
           <w:rStyle w:val="SubtleReference"/>
         </w:rPr>
-        <w:t>Configure VS Project File to point to the DX lib folder</w:t>
+        <w:t>Ramp Up Tests</w:t>
       </w:r>
     </w:p>
     <w:p>
       <w:pPr>
         <w:pStyle w:val="ColorfulList-Accent11"/>
         <w:numPr>
-          <w:ilvl w:val="0"/>
+          <w:ilvl w:val="1"/>
           <w:numId w:val="1"/>
         </w:numPr>
         <w:rPr>
@@ -489,29 +453,14 @@
         <w:rPr>
           <w:rStyle w:val="SubtleReference"/>
         </w:rPr>
-        <w:t>Compile sample code</w:t>
-      </w:r>
-    </w:p>
-    <w:p>
-      <w:pPr>
-        <w:pStyle w:val="ColorfulList-Accent11"/>
-        <w:ind w:left="0"/>
-        <w:rPr>
-          <w:rStyle w:val="SubtleReference"/>
-        </w:rPr>
-      </w:pPr>
-      <w:r>
-        <w:rPr>
-          <w:rStyle w:val="SubtleReference"/>
-        </w:rPr>
-        <w:t>Not: (Bad)</w:t>
+        <w:t>Repeatability</w:t>
       </w:r>
     </w:p>
     <w:p>
       <w:pPr>
         <w:pStyle w:val="ColorfulList-Accent11"/>
         <w:numPr>
-          <w:ilvl w:val="0"/>
+          <w:ilvl w:val="1"/>
           <w:numId w:val="1"/>
         </w:numPr>
         <w:rPr>
@@ -522,14 +471,14 @@
         <w:rPr>
           <w:rStyle w:val="SubtleReference"/>
         </w:rPr>
-        <w:t>Read the source code</w:t>
+        <w:t>Function Comparisons</w:t>
       </w:r>
     </w:p>
     <w:p>
       <w:pPr>
         <w:pStyle w:val="ColorfulList-Accent11"/>
         <w:numPr>
-          <w:ilvl w:val="0"/>
+          <w:ilvl w:val="1"/>
           <w:numId w:val="1"/>
         </w:numPr>
         <w:rPr>
@@ -540,14 +489,14 @@
         <w:rPr>
           <w:rStyle w:val="SubtleReference"/>
         </w:rPr>
-        <w:t>I had some trouble with SDL, so I spent a couple of weeks doing other spikes</w:t>
+        <w:t>IDE Settings</w:t>
       </w:r>
     </w:p>
     <w:p>
       <w:pPr>
         <w:pStyle w:val="ColorfulList-Accent11"/>
         <w:numPr>
-          <w:ilvl w:val="0"/>
+          <w:ilvl w:val="1"/>
           <w:numId w:val="1"/>
         </w:numPr>
         <w:rPr>
@@ -558,25 +507,7 @@
         <w:rPr>
           <w:rStyle w:val="SubtleReference"/>
         </w:rPr>
-        <w:t>Run code</w:t>
-      </w:r>
-    </w:p>
-    <w:p>
-      <w:pPr>
-        <w:pStyle w:val="ColorfulList-Accent11"/>
-        <w:numPr>
-          <w:ilvl w:val="0"/>
-          <w:numId w:val="1"/>
-        </w:numPr>
-        <w:rPr>
-          <w:rStyle w:val="SubtleReference"/>
-        </w:rPr>
-      </w:pPr>
-      <w:r>
-        <w:rPr>
-          <w:rStyle w:val="SubtleReference"/>
-        </w:rPr>
-        <w:t>Write Spike Report</w:t>
+        <w:t>Compiler Settings</w:t>
       </w:r>
     </w:p>
     <w:p>
@@ -643,14 +574,30 @@
         </w:rPr>
         <w:t xml:space="preserve"> as </w:t>
       </w:r>
-      <w:proofErr w:type="gramStart"/>
-      <w:r>
-        <w:rPr>
-          <w:rStyle w:val="SubtleReference"/>
-        </w:rPr>
-        <w:t>needed</w:t>
-      </w:r>
-      <w:proofErr w:type="gramEnd"/>
+      <w:r>
+        <w:rPr>
+          <w:rStyle w:val="SubtleReference"/>
+        </w:rPr>
+        <w:t>needed.</w:t>
+      </w:r>
+    </w:p>
+    <w:p>
+      <w:pPr>
+        <w:pStyle w:val="ColorfulList-Accent11"/>
+        <w:ind w:left="0"/>
+        <w:rPr>
+          <w:rStyle w:val="SubtleReference"/>
+        </w:rPr>
+      </w:pPr>
+    </w:p>
+    <w:p>
+      <w:pPr>
+        <w:pStyle w:val="ColorfulList-Accent11"/>
+        <w:ind w:left="0"/>
+        <w:rPr>
+          <w:rStyle w:val="SubtleReference"/>
+        </w:rPr>
+      </w:pPr>
     </w:p>
     <w:p>
       <w:pPr>
@@ -1049,7 +996,7 @@
         <w:rFonts w:ascii="Symbol" w:eastAsia="MS Mincho" w:hAnsi="Symbol" w:cs="Times New Roman" w:hint="default"/>
       </w:rPr>
     </w:lvl>
-    <w:lvl w:ilvl="1" w:tplc="04090003" w:tentative="1">
+    <w:lvl w:ilvl="1" w:tplc="04090003">
       <w:start w:val="1"/>
       <w:numFmt w:val="bullet"/>
       <w:lvlText w:val="o"/>

</xml_diff>